<commit_message>
feat: añadir archivos de entrega
</commit_message>
<xml_diff>
--- a/entrega/Memoria.docx
+++ b/entrega/Memoria.docx
@@ -2,7 +2,6 @@
 <file path=word/document.xml><?xml version="1.0" encoding="utf-8"?>
 <w:document xmlns:wpc="http://schemas.microsoft.com/office/word/2010/wordprocessingCanvas" xmlns:cx="http://schemas.microsoft.com/office/drawing/2014/chartex" xmlns:cx1="http://schemas.microsoft.com/office/drawing/2015/9/8/chartex" xmlns:cx2="http://schemas.microsoft.com/office/drawing/2015/10/21/chartex" xmlns:cx3="http://schemas.microsoft.com/office/drawing/2016/5/9/chartex" xmlns:cx4="http://schemas.microsoft.com/office/drawing/2016/5/10/chartex" xmlns:cx5="http://schemas.microsoft.com/office/drawing/2016/5/11/chartex" xmlns:cx6="http://schemas.microsoft.com/office/drawing/2016/5/12/chartex" xmlns:cx7="http://schemas.microsoft.com/office/drawing/2016/5/13/chartex" xmlns:cx8="http://schemas.microsoft.com/office/drawing/2016/5/14/chartex" xmlns:mc="http://schemas.openxmlformats.org/markup-compatibility/2006" xmlns:aink="http://schemas.microsoft.com/office/drawing/2016/ink" xmlns:am3d="http://schemas.microsoft.com/office/drawing/2017/model3d" xmlns:o="urn:schemas-microsoft-com:office:office" xmlns:oel="http://schemas.microsoft.com/office/2019/extlst" xmlns:r="http://schemas.openxmlformats.org/officeDocument/2006/relationships" xmlns:m="http://schemas.openxmlformats.org/officeDocument/2006/math" xmlns:v="urn:schemas-microsoft-com:vml" xmlns:wp14="http://schemas.microsoft.com/office/word/2010/wordprocessingDrawing" xmlns:wp="http://schemas.openxmlformats.org/drawingml/2006/wordprocessingDrawing" xmlns:w10="urn:schemas-microsoft-com:office:word" xmlns:w="http://schemas.openxmlformats.org/wordprocessingml/2006/main" xmlns:w14="http://schemas.microsoft.com/office/word/2010/wordml" xmlns:w15="http://schemas.microsoft.com/office/word/2012/wordml" xmlns:w16cex="http://schemas.microsoft.com/office/word/2018/wordml/cex" xmlns:w16cid="http://schemas.microsoft.com/office/word/2016/wordml/cid" xmlns:w16="http://schemas.microsoft.com/office/word/2018/wordml" xmlns:w16du="http://schemas.microsoft.com/office/word/2023/wordml/word16du" xmlns:w16sdtdh="http://schemas.microsoft.com/office/word/2020/wordml/sdtdatahash" xmlns:w16sdtfl="http://schemas.microsoft.com/office/word/2024/wordml/sdtformatlock" xmlns:w16se="http://schemas.microsoft.com/office/word/2015/wordml/symex" xmlns:wpg="http://schemas.microsoft.com/office/word/2010/wordprocessingGroup" xmlns:wpi="http://schemas.microsoft.com/office/word/2010/wordprocessingInk" xmlns:wne="http://schemas.microsoft.com/office/word/2006/wordml" xmlns:wps="http://schemas.microsoft.com/office/word/2010/wordprocessingShape" mc:Ignorable="w14 w15 w16se w16cid w16 w16cex w16sdtdh w16sdtfl w16du wp14">
   <w:body>
-    <w:p/>
     <w:tbl>
       <w:tblPr>
         <w:tblStyle w:val="Tabladelista4-nfasis1"/>
@@ -184,23 +183,7 @@
           <w:sz w:val="20"/>
           <w:szCs w:val="20"/>
         </w:rPr>
-        <w:t xml:space="preserve">). Las clases abstractas Sensor y Actuador añaden la lógica compartida entre Sensores (unidad de medida, último valor) y Actuadores </w:t>
-      </w:r>
-      <w:proofErr w:type="gramStart"/>
-      <w:r>
-        <w:rPr>
-          <w:sz w:val="20"/>
-          <w:szCs w:val="20"/>
-        </w:rPr>
-        <w:t>( estado</w:t>
-      </w:r>
-      <w:proofErr w:type="gramEnd"/>
-      <w:r>
-        <w:rPr>
-          <w:sz w:val="20"/>
-          <w:szCs w:val="20"/>
-        </w:rPr>
-        <w:t xml:space="preserve"> actual, validación de acciones) dejando la lógica específica para las implementaciones de las subclases concretas.  </w:t>
+        <w:t xml:space="preserve">). Las clases abstractas Sensor y Actuador añaden la lógica compartida entre Sensores (unidad de medida, último valor) y Actuadores (estado actual, validación de acciones) dejando la lógica específica para las implementaciones de las subclases concretas.  </w:t>
       </w:r>
     </w:p>
     <w:p>
@@ -216,14 +199,7 @@
           <w:sz w:val="20"/>
           <w:szCs w:val="20"/>
         </w:rPr>
-        <w:t xml:space="preserve">Además, </w:t>
-      </w:r>
-      <w:r>
-        <w:rPr>
-          <w:sz w:val="20"/>
-          <w:szCs w:val="20"/>
-        </w:rPr>
-        <w:t xml:space="preserve">Cada clase abstracta incluye un método estático </w:t>
+        <w:t xml:space="preserve">Además, Cada clase abstracta incluye un método estático </w:t>
       </w:r>
       <w:proofErr w:type="gramStart"/>
       <w:r>
@@ -536,14 +512,7 @@
                 <w:sz w:val="20"/>
                 <w:szCs w:val="20"/>
               </w:rPr>
-              <w:t> gestiona la persistencia. Cada clase tiene una sola r</w:t>
-            </w:r>
-            <w:r>
-              <w:rPr>
-                <w:sz w:val="20"/>
-                <w:szCs w:val="20"/>
-              </w:rPr>
-              <w:t>esponsabilidad clara.</w:t>
+              <w:t> gestiona la persistencia. Cada clase tiene una sola responsabilidad clara.</w:t>
             </w:r>
           </w:p>
         </w:tc>
@@ -624,16 +593,19 @@
           <w:p>
             <w:pPr>
               <w:rPr>
+                <w:b w:val="0"/>
+                <w:bCs w:val="0"/>
                 <w:sz w:val="20"/>
                 <w:szCs w:val="20"/>
               </w:rPr>
             </w:pPr>
             <w:r>
               <w:rPr>
-                <w:sz w:val="20"/>
-                <w:szCs w:val="20"/>
-              </w:rPr>
-              <w:lastRenderedPageBreak/>
+                <w:b w:val="0"/>
+                <w:bCs w:val="0"/>
+                <w:sz w:val="20"/>
+                <w:szCs w:val="20"/>
+              </w:rPr>
               <w:t>L — Sustitución de Liskov</w:t>
             </w:r>
           </w:p>
@@ -669,15 +641,20 @@
           <w:p>
             <w:pPr>
               <w:rPr>
+                <w:b w:val="0"/>
+                <w:bCs w:val="0"/>
                 <w:sz w:val="20"/>
                 <w:szCs w:val="20"/>
               </w:rPr>
             </w:pPr>
             <w:r>
               <w:rPr>
-                <w:sz w:val="20"/>
-                <w:szCs w:val="20"/>
-              </w:rPr>
+                <w:b w:val="0"/>
+                <w:bCs w:val="0"/>
+                <w:sz w:val="20"/>
+                <w:szCs w:val="20"/>
+              </w:rPr>
+              <w:lastRenderedPageBreak/>
               <w:t>I — Segregación de interfaces</w:t>
             </w:r>
           </w:p>
@@ -725,12 +702,16 @@
           <w:p>
             <w:pPr>
               <w:rPr>
+                <w:b w:val="0"/>
+                <w:bCs w:val="0"/>
                 <w:sz w:val="20"/>
                 <w:szCs w:val="20"/>
               </w:rPr>
             </w:pPr>
             <w:r>
               <w:rPr>
+                <w:b w:val="0"/>
+                <w:bCs w:val="0"/>
                 <w:sz w:val="20"/>
                 <w:szCs w:val="20"/>
               </w:rPr>
@@ -763,14 +744,7 @@
                 <w:sz w:val="20"/>
                 <w:szCs w:val="20"/>
               </w:rPr>
-              <w:t>I</w:t>
-            </w:r>
-            <w:r>
-              <w:rPr>
-                <w:sz w:val="20"/>
-                <w:szCs w:val="20"/>
-              </w:rPr>
-              <w:t>Regla</w:t>
+              <w:t>IRegla</w:t>
             </w:r>
             <w:proofErr w:type="spellEnd"/>
             <w:r>
@@ -802,14 +776,7 @@
                 <w:sz w:val="20"/>
                 <w:szCs w:val="20"/>
               </w:rPr>
-              <w:t>I</w:t>
-            </w:r>
-            <w:r>
-              <w:rPr>
-                <w:sz w:val="20"/>
-                <w:szCs w:val="20"/>
-              </w:rPr>
-              <w:t>Regla</w:t>
+              <w:t>IRegla</w:t>
             </w:r>
             <w:proofErr w:type="spellEnd"/>
             <w:r>
@@ -875,23 +842,35 @@
           <w:sz w:val="20"/>
           <w:szCs w:val="20"/>
         </w:rPr>
-        <w:t xml:space="preserve"> Se implementa en el Sistema de Reglas. El motivo es que las reglas de negocio deben ser intercambiables. Con este patrón, para añadir una nueva regla basta con crear </w:t>
-      </w:r>
-      <w:proofErr w:type="gramStart"/>
-      <w:r>
-        <w:rPr>
-          <w:sz w:val="20"/>
-          <w:szCs w:val="20"/>
-        </w:rPr>
-        <w:t>un nueva clase</w:t>
-      </w:r>
-      <w:proofErr w:type="gramEnd"/>
-      <w:r>
-        <w:rPr>
-          <w:sz w:val="20"/>
-          <w:szCs w:val="20"/>
-        </w:rPr>
-        <w:t xml:space="preserve"> que la implemente y añadirla a la lista.</w:t>
+        <w:t xml:space="preserve"> Se implementa en el Sistema de Reglas. El motivo es que las reglas de negocio deben ser intercambiables. Con este patrón, para añadir una nueva regla basta con crear un</w:t>
+      </w:r>
+      <w:r>
+        <w:rPr>
+          <w:sz w:val="20"/>
+          <w:szCs w:val="20"/>
+        </w:rPr>
+        <w:t>a</w:t>
+      </w:r>
+      <w:r>
+        <w:rPr>
+          <w:sz w:val="20"/>
+          <w:szCs w:val="20"/>
+        </w:rPr>
+        <w:t xml:space="preserve"> nueva</w:t>
+      </w:r>
+      <w:r>
+        <w:rPr>
+          <w:sz w:val="20"/>
+          <w:szCs w:val="20"/>
+        </w:rPr>
+        <w:t xml:space="preserve"> </w:t>
+      </w:r>
+      <w:r>
+        <w:rPr>
+          <w:sz w:val="20"/>
+          <w:szCs w:val="20"/>
+        </w:rPr>
+        <w:t>clase que la implemente y añadirla a la lista.</w:t>
       </w:r>
     </w:p>
     <w:p>
@@ -966,7 +945,7 @@
           <w:sz w:val="20"/>
           <w:szCs w:val="20"/>
         </w:rPr>
-        <w:t xml:space="preserve">Patrón </w:t>
+        <w:t>Patrón Singleton</w:t>
       </w:r>
       <w:r>
         <w:rPr>
@@ -975,15 +954,6 @@
           <w:sz w:val="20"/>
           <w:szCs w:val="20"/>
         </w:rPr>
-        <w:t>Singleton</w:t>
-      </w:r>
-      <w:r>
-        <w:rPr>
-          <w:b/>
-          <w:bCs/>
-          <w:sz w:val="20"/>
-          <w:szCs w:val="20"/>
-        </w:rPr>
         <w:t xml:space="preserve">: </w:t>
       </w:r>
       <w:r>
@@ -1037,14 +1007,7 @@
           <w:sz w:val="20"/>
           <w:szCs w:val="20"/>
         </w:rPr>
-        <w:t xml:space="preserve">. Ambas clases </w:t>
-      </w:r>
-      <w:r>
-        <w:rPr>
-          <w:sz w:val="20"/>
-          <w:szCs w:val="20"/>
-        </w:rPr>
-        <w:t>se instancias de manera única, garantizando que durante todo el ciclo de vida de la aplicación sólo exista una instancia.</w:t>
+        <w:t>. Ambas clases se instancias de manera única, garantizando que durante todo el ciclo de vida de la aplicación sólo exista una instancia.</w:t>
       </w:r>
     </w:p>
     <w:p>
@@ -1168,14 +1131,7 @@
           <w:sz w:val="20"/>
           <w:szCs w:val="20"/>
         </w:rPr>
-        <w:t> (si existe), restaurando el estado de los actuadores y las reglas activas de la sesión anterior.</w:t>
-      </w:r>
-      <w:r>
-        <w:rPr>
-          <w:sz w:val="20"/>
-          <w:szCs w:val="20"/>
-        </w:rPr>
-        <w:t xml:space="preserve"> </w:t>
+        <w:t xml:space="preserve"> (si existe), restaurando el estado de los actuadores y las reglas activas de la sesión anterior. </w:t>
       </w:r>
     </w:p>
     <w:p>
@@ -2266,6 +2222,7 @@
   <w:style w:type="character" w:default="1" w:styleId="Fuentedeprrafopredeter">
     <w:name w:val="Default Paragraph Font"/>
     <w:uiPriority w:val="1"/>
+    <w:semiHidden/>
     <w:unhideWhenUsed/>
   </w:style>
   <w:style w:type="table" w:default="1" w:styleId="Tablanormal">

</xml_diff>